<commit_message>
Update proposals with detailed framework synergy and breakdown
</commit_message>
<xml_diff>
--- a/docs/ROS2_HuggingFace_Proposals.docx
+++ b/docs/ROS2_HuggingFace_Proposals.docx
@@ -2,7 +2,7 @@
 <file path=word/document.xml><?xml version="1.0" encoding="utf-8"?>
 <w:document xmlns:w="http://schemas.openxmlformats.org/wordprocessingml/2006/main" xmlns:m="http://schemas.openxmlformats.org/officeDocument/2006/math" xmlns:r="http://schemas.openxmlformats.org/officeDocument/2006/relationships" xmlns:o="urn:schemas-microsoft-com:office:office" xmlns:v="urn:schemas-microsoft-com:vml" xmlns:w10="urn:schemas-microsoft-com:office:word" xmlns:a="http://schemas.openxmlformats.org/drawingml/2006/main" xmlns:pic="http://schemas.openxmlformats.org/drawingml/2006/picture" xmlns:wp="http://schemas.openxmlformats.org/drawingml/2006/wordprocessingDrawing">
   <w:body>
-    <w:bookmarkStart w:id="26" w:name="Xeda0bf636e6a989f798585bfb3b54e5a386c3b3"/>
+    <w:bookmarkStart w:id="32" w:name="Xeda0bf636e6a989f798585bfb3b54e5a386c3b3"/>
     <w:p>
       <w:pPr>
         <w:pStyle w:val="Heading1"/>
@@ -702,7 +702,7 @@
       </w:r>
     </w:p>
     <w:bookmarkEnd w:id="24"/>
-    <w:bookmarkStart w:id="25" w:name="recommendation"/>
+    <w:bookmarkStart w:id="27" w:name="recommendation"/>
     <w:p>
       <w:pPr>
         <w:pStyle w:val="Heading2"/>
@@ -789,9 +789,461 @@
       <w:r>
         <w:t xml:space="preserve">.</w:t>
       </w:r>
+      <w:r>
+        <w:t xml:space="preserve"> </w:t>
+      </w:r>
+      <w:r>
+        <w:t xml:space="preserve">## Framework Synergy &amp; Architecture Deep-Dive</w:t>
+      </w:r>
+    </w:p>
+    <w:bookmarkStart w:id="25" w:name="ros-2-the-heavy-lifter"/>
+    <w:p>
+      <w:pPr>
+        <w:pStyle w:val="Heading3"/>
+      </w:pPr>
+      <w:r>
+        <w:t xml:space="preserve">ROS 2 (The Heavy Lifter)</w:t>
+      </w:r>
+    </w:p>
+    <w:p>
+      <w:pPr>
+        <w:pStyle w:val="FirstParagraph"/>
+      </w:pPr>
+      <w:r>
+        <w:t xml:space="preserve">ROS 2 is the standard middleware for robotics (nodes, topics, services) that handles the actual physics simulation, sensors, and actuators. Simulation platforms like Gazebo, Webots, or NVIDIA Isaac Sim plug right into ROS 2 to handle the physical reality of the environment. It manages the sensors (cameras, LiDAR, IMUs) and handles the low-level motor controllers (</w:t>
+      </w:r>
+      <w:r>
+        <w:rPr>
+          <w:rStyle w:val="VerbatimChar"/>
+        </w:rPr>
+        <w:t xml:space="preserve">ros2_control</w:t>
+      </w:r>
+      <w:r>
+        <w:t xml:space="preserve"> </w:t>
+      </w:r>
+      <w:r>
+        <w:t xml:space="preserve">/ MoveIt2).</w:t>
+      </w:r>
     </w:p>
     <w:bookmarkEnd w:id="25"/>
+    <w:bookmarkStart w:id="26" w:name="hugging-face-lerobot-the-brain"/>
+    <w:p>
+      <w:pPr>
+        <w:pStyle w:val="Heading3"/>
+      </w:pPr>
+      <w:r>
+        <w:t xml:space="preserve">Hugging Face LeRobot (The Brain)</w:t>
+      </w:r>
+    </w:p>
+    <w:p>
+      <w:pPr>
+        <w:pStyle w:val="FirstParagraph"/>
+      </w:pPr>
+      <w:r>
+        <w:t xml:space="preserve">Hugging Face’s flagship robotics library. It uses a Gym-style interface (</w:t>
+      </w:r>
+      <w:r>
+        <w:rPr>
+          <w:rStyle w:val="VerbatimChar"/>
+        </w:rPr>
+        <w:t xml:space="preserve">RLEnv</w:t>
+      </w:r>
+      <w:r>
+        <w:t xml:space="preserve">), connects to ROS 2 via</w:t>
+      </w:r>
+      <w:r>
+        <w:t xml:space="preserve"> </w:t>
+      </w:r>
+      <w:r>
+        <w:rPr>
+          <w:rStyle w:val="VerbatimChar"/>
+        </w:rPr>
+        <w:t xml:space="preserve">lerobot-ros</w:t>
+      </w:r>
+      <w:r>
+        <w:t xml:space="preserve"> </w:t>
+      </w:r>
+      <w:r>
+        <w:t xml:space="preserve">(and tools like</w:t>
+      </w:r>
+      <w:r>
+        <w:t xml:space="preserve"> </w:t>
+      </w:r>
+      <w:r>
+        <w:rPr>
+          <w:rStyle w:val="VerbatimChar"/>
+        </w:rPr>
+        <w:t xml:space="preserve">rosetta</w:t>
+      </w:r>
+      <w:r>
+        <w:t xml:space="preserve"> </w:t>
+      </w:r>
+      <w:r>
+        <w:t xml:space="preserve">to convert ROS 2 bags to datasets), and integrates tightly with Hugging Face Hub (EnvHub for environments, model sharing, Stable-Baselines3). It takes the sensor data from ROS 2, runs it through an RL algorithm (like PPO or SAC), and sends velocity or torque commands back to the ROS 2 simulation.</w:t>
+      </w:r>
+    </w:p>
+    <w:p>
+      <w:r>
+        <w:pict>
+          <v:rect style="width:0;height:1.5pt" o:hralign="center" o:hrstd="t" o:hr="t"/>
+        </w:pict>
+      </w:r>
+    </w:p>
     <w:bookmarkEnd w:id="26"/>
+    <w:bookmarkEnd w:id="27"/>
+    <w:bookmarkStart w:id="31" w:name="detailed-project-breakdown"/>
+    <w:p>
+      <w:pPr>
+        <w:pStyle w:val="Heading2"/>
+      </w:pPr>
+      <w:r>
+        <w:t xml:space="preserve">Detailed Project Breakdown</w:t>
+      </w:r>
+    </w:p>
+    <w:bookmarkStart w:id="28" w:name="X03ed7508f6c9e4a34e82b429764c469a6e48e86"/>
+    <w:p>
+      <w:pPr>
+        <w:pStyle w:val="Heading3"/>
+      </w:pPr>
+      <w:r>
+        <w:t xml:space="preserve">1. Autonomous Mobile Robot (AMR) Navigation in Dynamic Environments</w:t>
+      </w:r>
+    </w:p>
+    <w:p>
+      <w:pPr>
+        <w:numPr>
+          <w:ilvl w:val="0"/>
+          <w:numId w:val="1012"/>
+        </w:numPr>
+        <w:pStyle w:val="Compact"/>
+      </w:pPr>
+      <w:r>
+        <w:rPr>
+          <w:bCs/>
+          <w:b/>
+        </w:rPr>
+        <w:t xml:space="preserve">Concept:</w:t>
+      </w:r>
+      <w:r>
+        <w:t xml:space="preserve"> </w:t>
+      </w:r>
+      <w:r>
+        <w:t xml:space="preserve">Train a wheeled robot (like a TurtleBot3 or a custom mobile base) to navigate a maze or a warehouse simulation while avoiding moving obstacles.</w:t>
+      </w:r>
+    </w:p>
+    <w:p>
+      <w:pPr>
+        <w:numPr>
+          <w:ilvl w:val="0"/>
+          <w:numId w:val="1012"/>
+        </w:numPr>
+        <w:pStyle w:val="Compact"/>
+      </w:pPr>
+      <w:r>
+        <w:rPr>
+          <w:bCs/>
+          <w:b/>
+        </w:rPr>
+        <w:t xml:space="preserve">ROS 2 Side:</w:t>
+      </w:r>
+      <w:r>
+        <w:t xml:space="preserve"> </w:t>
+      </w:r>
+      <w:r>
+        <w:t xml:space="preserve">Gazebo simulation, ROS 2 Nav2 stack (for localization/mapping), Lidar/depth camera sensors.</w:t>
+      </w:r>
+    </w:p>
+    <w:p>
+      <w:pPr>
+        <w:numPr>
+          <w:ilvl w:val="0"/>
+          <w:numId w:val="1012"/>
+        </w:numPr>
+        <w:pStyle w:val="Compact"/>
+      </w:pPr>
+      <w:r>
+        <w:rPr>
+          <w:bCs/>
+          <w:b/>
+        </w:rPr>
+        <w:t xml:space="preserve">Hugging Face Side:</w:t>
+      </w:r>
+      <w:r>
+        <w:t xml:space="preserve"> </w:t>
+      </w:r>
+      <w:r>
+        <w:t xml:space="preserve">Use Stable-Baselines3 (PPO or SAC) wrapped with LeRobot’s environment hub. The RL agent learns to map Lidar data to continuous steering and velocity commands.</w:t>
+      </w:r>
+    </w:p>
+    <w:p>
+      <w:pPr>
+        <w:numPr>
+          <w:ilvl w:val="0"/>
+          <w:numId w:val="1012"/>
+        </w:numPr>
+        <w:pStyle w:val="Compact"/>
+      </w:pPr>
+      <w:r>
+        <w:rPr>
+          <w:bCs/>
+          <w:b/>
+        </w:rPr>
+        <w:t xml:space="preserve">Demo Value:</w:t>
+      </w:r>
+      <w:r>
+        <w:t xml:space="preserve"> </w:t>
+      </w:r>
+      <w:r>
+        <w:t xml:space="preserve">Very visual. You can show the robot learning from colliding with walls to smoothly weaving around obstacles in a Gazebo UI.</w:t>
+      </w:r>
+    </w:p>
+    <w:bookmarkEnd w:id="28"/>
+    <w:bookmarkStart w:id="29" w:name="Xa1e0105f8eb90e4d2abd3671b3d1c1e2d650b65"/>
+    <w:p>
+      <w:pPr>
+        <w:pStyle w:val="Heading3"/>
+      </w:pPr>
+      <w:r>
+        <w:t xml:space="preserve">2. Robotic Arm Pick-and-Place with Human-in-the-loop (HIL) Intervention</w:t>
+      </w:r>
+    </w:p>
+    <w:p>
+      <w:pPr>
+        <w:numPr>
+          <w:ilvl w:val="0"/>
+          <w:numId w:val="1013"/>
+        </w:numPr>
+        <w:pStyle w:val="Compact"/>
+      </w:pPr>
+      <w:r>
+        <w:rPr>
+          <w:bCs/>
+          <w:b/>
+        </w:rPr>
+        <w:t xml:space="preserve">Concept:</w:t>
+      </w:r>
+      <w:r>
+        <w:t xml:space="preserve"> </w:t>
+      </w:r>
+      <w:r>
+        <w:t xml:space="preserve">Train a 6-DOF robotic arm (like a Franka Panda or UR5) to pick up objects from a bin and place them in a specific location using visual inputs (camera).</w:t>
+      </w:r>
+    </w:p>
+    <w:p>
+      <w:pPr>
+        <w:numPr>
+          <w:ilvl w:val="0"/>
+          <w:numId w:val="1013"/>
+        </w:numPr>
+        <w:pStyle w:val="Compact"/>
+      </w:pPr>
+      <w:r>
+        <w:rPr>
+          <w:bCs/>
+          <w:b/>
+        </w:rPr>
+        <w:t xml:space="preserve">ROS 2 Side:</w:t>
+      </w:r>
+      <w:r>
+        <w:t xml:space="preserve"> </w:t>
+      </w:r>
+      <w:r>
+        <w:t xml:space="preserve">MoveIt2 for kinematics, Gazebo/MuJoCo for physics,</w:t>
+      </w:r>
+      <w:r>
+        <w:t xml:space="preserve"> </w:t>
+      </w:r>
+      <w:r>
+        <w:rPr>
+          <w:rStyle w:val="VerbatimChar"/>
+        </w:rPr>
+        <w:t xml:space="preserve">ros2_control</w:t>
+      </w:r>
+      <w:r>
+        <w:t xml:space="preserve"> </w:t>
+      </w:r>
+      <w:r>
+        <w:t xml:space="preserve">to actuate joints.</w:t>
+      </w:r>
+    </w:p>
+    <w:p>
+      <w:pPr>
+        <w:numPr>
+          <w:ilvl w:val="0"/>
+          <w:numId w:val="1013"/>
+        </w:numPr>
+        <w:pStyle w:val="Compact"/>
+      </w:pPr>
+      <w:r>
+        <w:rPr>
+          <w:bCs/>
+          <w:b/>
+        </w:rPr>
+        <w:t xml:space="preserve">Hugging Face Side:</w:t>
+      </w:r>
+      <w:r>
+        <w:t xml:space="preserve"> </w:t>
+      </w:r>
+      <w:r>
+        <w:t xml:space="preserve">Use LeRobot’s</w:t>
+      </w:r>
+      <w:r>
+        <w:t xml:space="preserve"> </w:t>
+      </w:r>
+      <w:r>
+        <w:rPr>
+          <w:rStyle w:val="VerbatimChar"/>
+        </w:rPr>
+        <w:t xml:space="preserve">gym_hil</w:t>
+      </w:r>
+      <w:r>
+        <w:t xml:space="preserve"> </w:t>
+      </w:r>
+      <w:r>
+        <w:t xml:space="preserve">(Human-In-the-Loop) to train a policy. You start by using imitation learning (teleop) to record a dataset, upload to HF Hub, pre-train, and then use Reinforcement Learning (RL) to fine-tune the agent’s precision.</w:t>
+      </w:r>
+    </w:p>
+    <w:p>
+      <w:pPr>
+        <w:numPr>
+          <w:ilvl w:val="0"/>
+          <w:numId w:val="1013"/>
+        </w:numPr>
+        <w:pStyle w:val="Compact"/>
+      </w:pPr>
+      <w:r>
+        <w:rPr>
+          <w:bCs/>
+          <w:b/>
+        </w:rPr>
+        <w:t xml:space="preserve">Demo Value:</w:t>
+      </w:r>
+      <w:r>
+        <w:t xml:space="preserve"> </w:t>
+      </w:r>
+      <w:r>
+        <w:t xml:space="preserve">High tech. Shows off computer vision, manipulator kinematics, and the transition from human demonstration to autonomous RL refinement.</w:t>
+      </w:r>
+    </w:p>
+    <w:bookmarkEnd w:id="29"/>
+    <w:bookmarkStart w:id="30" w:name="quadruped-robot-dog-terrain-adaptation"/>
+    <w:p>
+      <w:pPr>
+        <w:pStyle w:val="Heading3"/>
+      </w:pPr>
+      <w:r>
+        <w:t xml:space="preserve">3. Quadruped (Robot Dog) Terrain Adaptation</w:t>
+      </w:r>
+    </w:p>
+    <w:p>
+      <w:pPr>
+        <w:numPr>
+          <w:ilvl w:val="0"/>
+          <w:numId w:val="1014"/>
+        </w:numPr>
+        <w:pStyle w:val="Compact"/>
+      </w:pPr>
+      <w:r>
+        <w:rPr>
+          <w:bCs/>
+          <w:b/>
+        </w:rPr>
+        <w:t xml:space="preserve">Concept:</w:t>
+      </w:r>
+      <w:r>
+        <w:t xml:space="preserve"> </w:t>
+      </w:r>
+      <w:r>
+        <w:t xml:space="preserve">Train a quadruped robot to walk across uneven terrain or stairs without falling over.</w:t>
+      </w:r>
+    </w:p>
+    <w:p>
+      <w:pPr>
+        <w:numPr>
+          <w:ilvl w:val="0"/>
+          <w:numId w:val="1014"/>
+        </w:numPr>
+        <w:pStyle w:val="Compact"/>
+      </w:pPr>
+      <w:r>
+        <w:rPr>
+          <w:bCs/>
+          <w:b/>
+        </w:rPr>
+        <w:t xml:space="preserve">ROS 2 Side:</w:t>
+      </w:r>
+      <w:r>
+        <w:t xml:space="preserve"> </w:t>
+      </w:r>
+      <w:r>
+        <w:t xml:space="preserve">ROS 2 controllers, NVIDIA Isaac Sim or Gazebo (needs robust physics).</w:t>
+      </w:r>
+    </w:p>
+    <w:p>
+      <w:pPr>
+        <w:numPr>
+          <w:ilvl w:val="0"/>
+          <w:numId w:val="1014"/>
+        </w:numPr>
+        <w:pStyle w:val="Compact"/>
+      </w:pPr>
+      <w:r>
+        <w:rPr>
+          <w:bCs/>
+          <w:b/>
+        </w:rPr>
+        <w:t xml:space="preserve">Hugging Face Side:</w:t>
+      </w:r>
+      <w:r>
+        <w:t xml:space="preserve"> </w:t>
+      </w:r>
+      <w:r>
+        <w:t xml:space="preserve">Deep Reinforcement Learning. The state space is joint positions, IMU data (balance), and ray-casting. Action space is joint torques. We pull a pre-trained baseline model from Hugging Face Hub, and then train it in our specific simulated environment using Proximal Policy Optimization (PPO).</w:t>
+      </w:r>
+    </w:p>
+    <w:p>
+      <w:pPr>
+        <w:numPr>
+          <w:ilvl w:val="0"/>
+          <w:numId w:val="1014"/>
+        </w:numPr>
+        <w:pStyle w:val="Compact"/>
+      </w:pPr>
+      <w:r>
+        <w:rPr>
+          <w:bCs/>
+          <w:b/>
+        </w:rPr>
+        <w:t xml:space="preserve">Demo Value:</w:t>
+      </w:r>
+      <w:r>
+        <w:t xml:space="preserve"> </w:t>
+      </w:r>
+      <w:r>
+        <w:t xml:space="preserve">The</w:t>
+      </w:r>
+      <w:r>
+        <w:t xml:space="preserve"> </w:t>
+      </w:r>
+      <w:r>
+        <w:t xml:space="preserve">“</w:t>
+      </w:r>
+      <w:r>
+        <w:t xml:space="preserve">wow</w:t>
+      </w:r>
+      <w:r>
+        <w:t xml:space="preserve">”</w:t>
+      </w:r>
+      <w:r>
+        <w:t xml:space="preserve"> </w:t>
+      </w:r>
+      <w:r>
+        <w:t xml:space="preserve">factor. Watching a robot dog learn to walk—first flailing, then stabilizing, then climbing—makes for an incredible visual demo.</w:t>
+      </w:r>
+    </w:p>
+    <w:bookmarkEnd w:id="30"/>
+    <w:bookmarkEnd w:id="31"/>
+    <w:bookmarkEnd w:id="32"/>
     <w:sectPr/>
   </w:body>
 </w:document>
@@ -1008,6 +1460,15 @@
     <w:abstractNumId w:val="991"/>
   </w:num>
   <w:num w:numId="1011">
+    <w:abstractNumId w:val="991"/>
+  </w:num>
+  <w:num w:numId="1012">
+    <w:abstractNumId w:val="991"/>
+  </w:num>
+  <w:num w:numId="1013">
+    <w:abstractNumId w:val="991"/>
+  </w:num>
+  <w:num w:numId="1014">
     <w:abstractNumId w:val="991"/>
   </w:num>
 </w:numbering>

</xml_diff>